<commit_message>
numbering of the requirements was wrong, changed it
</commit_message>
<xml_diff>
--- a/Lab - 1/requirements.docx
+++ b/Lab - 1/requirements.docx
@@ -24,13 +24,8 @@
             <w:tcW w:w="647" w:type="dxa"/>
           </w:tcPr>
           <w:p>
-            <w:proofErr w:type="spellStart"/>
-            <w:r>
-              <w:t>Req</w:t>
-            </w:r>
-            <w:proofErr w:type="spellEnd"/>
-            <w:r>
-              <w:t xml:space="preserve"> ID</w:t>
+            <w:r>
+              <w:t>Req ID</w:t>
             </w:r>
           </w:p>
         </w:tc>
@@ -168,10 +163,7 @@
           </w:tcPr>
           <w:p>
             <w:r>
-              <w:t>FR-00</w:t>
-            </w:r>
-            <w:r>
-              <w:t>2</w:t>
+              <w:t>FR-002</w:t>
             </w:r>
           </w:p>
         </w:tc>
@@ -238,10 +230,7 @@
           </w:tcPr>
           <w:p>
             <w:r>
-              <w:t>FR-00</w:t>
-            </w:r>
-            <w:r>
-              <w:t>3</w:t>
+              <w:t>FR-003</w:t>
             </w:r>
           </w:p>
         </w:tc>
@@ -311,7 +300,7 @@
               <w:t>FR-00</w:t>
             </w:r>
             <w:r>
-              <w:t>5</w:t>
+              <w:t>4</w:t>
             </w:r>
           </w:p>
         </w:tc>
@@ -366,13 +355,7 @@
           </w:tcPr>
           <w:p>
             <w:r>
-              <w:t>The target required for tracking household’s progress towards reducing</w:t>
-            </w:r>
-            <w:r>
-              <w:t xml:space="preserve"> its</w:t>
-            </w:r>
-            <w:r>
-              <w:t xml:space="preserve"> carbon footprint</w:t>
+              <w:t>The target required for tracking household’s progress towards reducing its carbon footprint</w:t>
             </w:r>
           </w:p>
         </w:tc>
@@ -384,10 +367,7 @@
           </w:tcPr>
           <w:p>
             <w:r>
-              <w:t>FR-00</w:t>
-            </w:r>
-            <w:r>
-              <w:t>5</w:t>
+              <w:t>FR-005</w:t>
             </w:r>
           </w:p>
         </w:tc>
@@ -463,10 +443,7 @@
           </w:tcPr>
           <w:p>
             <w:r>
-              <w:t>N</w:t>
-            </w:r>
-            <w:r>
-              <w:t>FR-001</w:t>
+              <w:t>NFR-001</w:t>
             </w:r>
           </w:p>
         </w:tc>
@@ -476,10 +453,7 @@
           </w:tcPr>
           <w:p>
             <w:r>
-              <w:t>Non-</w:t>
-            </w:r>
-            <w:r>
-              <w:t>Functional</w:t>
+              <w:t>Non-Functional</w:t>
             </w:r>
           </w:p>
         </w:tc>
@@ -494,13 +468,8 @@
             <w:r>
               <w:t xml:space="preserve"> </w:t>
             </w:r>
-            <w:proofErr w:type="spellStart"/>
-            <w:r>
-              <w:t>ms</w:t>
-            </w:r>
-            <w:proofErr w:type="spellEnd"/>
-            <w:r>
-              <w:t>.</w:t>
+            <w:r>
+              <w:t>ms.</w:t>
             </w:r>
           </w:p>
         </w:tc>
@@ -523,15 +492,7 @@
               <w:t xml:space="preserve">Pass: Benchmarking tests confirm </w:t>
             </w:r>
             <w:r>
-              <w:t xml:space="preserve">that the graphs render in under 200 </w:t>
-            </w:r>
-            <w:proofErr w:type="spellStart"/>
-            <w:r>
-              <w:t>ms</w:t>
-            </w:r>
-            <w:proofErr w:type="spellEnd"/>
-            <w:r>
-              <w:t xml:space="preserve"> under simulated peak load.</w:t>
+              <w:t>that the graphs render in under 200 ms under simulated peak load.</w:t>
             </w:r>
           </w:p>
           <w:p>
@@ -539,15 +500,7 @@
               <w:t xml:space="preserve">Fail: </w:t>
             </w:r>
             <w:r>
-              <w:t xml:space="preserve">The graph taker 200 </w:t>
-            </w:r>
-            <w:proofErr w:type="spellStart"/>
-            <w:r>
-              <w:t>ms</w:t>
-            </w:r>
-            <w:proofErr w:type="spellEnd"/>
-            <w:r>
-              <w:t xml:space="preserve"> or longer to render.</w:t>
+              <w:t>The graph taker 200 ms or longer to render.</w:t>
             </w:r>
           </w:p>
         </w:tc>
@@ -569,13 +522,7 @@
           </w:tcPr>
           <w:p>
             <w:r>
-              <w:t>N</w:t>
-            </w:r>
-            <w:r>
-              <w:t>FR-00</w:t>
-            </w:r>
-            <w:r>
-              <w:t>2</w:t>
+              <w:t>NFR-002</w:t>
             </w:r>
           </w:p>
         </w:tc>
@@ -585,10 +532,7 @@
           </w:tcPr>
           <w:p>
             <w:r>
-              <w:t>Non-</w:t>
-            </w:r>
-            <w:r>
-              <w:t>Functional</w:t>
+              <w:t>Non-Functional</w:t>
             </w:r>
           </w:p>
         </w:tc>
@@ -1253,6 +1197,7 @@
   <w:style w:type="character" w:default="1" w:styleId="DefaultParagraphFont">
     <w:name w:val="Default Paragraph Font"/>
     <w:uiPriority w:val="1"/>
+    <w:semiHidden/>
     <w:unhideWhenUsed/>
   </w:style>
   <w:style w:type="table" w:default="1" w:styleId="TableNormal">

</xml_diff>